<commit_message>
update lima modul berjalan
</commit_message>
<xml_diff>
--- a/worksheet-p11/FIRSTLY JAVIERRAZEL HERMAWAN - - 11. Worksheet_PABW_Pertemuan11 - ID.docx
+++ b/worksheet-p11/FIRSTLY JAVIERRAZEL HERMAWAN - - 11. Worksheet_PABW_Pertemuan11 - ID.docx
@@ -182,15 +182,7 @@
               <w:spacing w:after="0"/>
             </w:pPr>
             <w:r>
-              <w:t xml:space="preserve">Firstly </w:t>
-            </w:r>
-            <w:proofErr w:type="spellStart"/>
-            <w:r>
-              <w:t>Javierrazel</w:t>
-            </w:r>
-            <w:proofErr w:type="spellEnd"/>
-            <w:r>
-              <w:t xml:space="preserve"> Hermawan</w:t>
+              <w:t>Firstly Javierrazel Hermawan</w:t>
             </w:r>
           </w:p>
         </w:tc>
@@ -2077,11 +2069,9 @@
             <w:pPr>
               <w:spacing w:before="20" w:after="20" w:line="252" w:lineRule="auto"/>
             </w:pPr>
-            <w:proofErr w:type="spellStart"/>
             <w:r>
               <w:t>ada</w:t>
             </w:r>
-            <w:proofErr w:type="spellEnd"/>
           </w:p>
         </w:tc>
         <w:tc>
@@ -2170,11 +2160,9 @@
             <w:pPr>
               <w:spacing w:before="20" w:after="20" w:line="252" w:lineRule="auto"/>
             </w:pPr>
-            <w:proofErr w:type="spellStart"/>
             <w:r>
               <w:t>ada</w:t>
             </w:r>
-            <w:proofErr w:type="spellEnd"/>
           </w:p>
         </w:tc>
         <w:tc>
@@ -2263,11 +2251,9 @@
             <w:pPr>
               <w:spacing w:before="20" w:after="20" w:line="252" w:lineRule="auto"/>
             </w:pPr>
-            <w:proofErr w:type="spellStart"/>
             <w:r>
               <w:t>ada</w:t>
             </w:r>
-            <w:proofErr w:type="spellEnd"/>
           </w:p>
         </w:tc>
         <w:tc>
@@ -2356,11 +2342,9 @@
             <w:pPr>
               <w:spacing w:before="20" w:after="20" w:line="252" w:lineRule="auto"/>
             </w:pPr>
-            <w:proofErr w:type="spellStart"/>
             <w:r>
               <w:t>ada</w:t>
             </w:r>
-            <w:proofErr w:type="spellEnd"/>
           </w:p>
         </w:tc>
         <w:tc>
@@ -2529,13 +2513,9 @@
             <w:pPr>
               <w:spacing w:before="20" w:after="20" w:line="252" w:lineRule="auto"/>
             </w:pPr>
-            <w:proofErr w:type="spellStart"/>
-            <w:proofErr w:type="gramStart"/>
             <w:r>
               <w:t>Api,js</w:t>
             </w:r>
-            <w:proofErr w:type="spellEnd"/>
-            <w:proofErr w:type="gramEnd"/>
           </w:p>
         </w:tc>
         <w:tc>
@@ -2552,11 +2532,9 @@
             <w:pPr>
               <w:spacing w:before="20" w:after="20" w:line="252" w:lineRule="auto"/>
             </w:pPr>
-            <w:proofErr w:type="spellStart"/>
             <w:r>
               <w:t>tidak</w:t>
             </w:r>
-            <w:proofErr w:type="spellEnd"/>
           </w:p>
         </w:tc>
         <w:tc>
@@ -2573,61 +2551,8 @@
             <w:pPr>
               <w:spacing w:before="20" w:after="20" w:line="252" w:lineRule="auto"/>
             </w:pPr>
-            <w:proofErr w:type="spellStart"/>
-            <w:r>
-              <w:t>Dibiarkan</w:t>
-            </w:r>
-            <w:proofErr w:type="spellEnd"/>
-            <w:r>
-              <w:t>/</w:t>
-            </w:r>
-            <w:proofErr w:type="spellStart"/>
-            <w:r>
-              <w:t>diimpor</w:t>
-            </w:r>
-            <w:proofErr w:type="spellEnd"/>
-            <w:r>
-              <w:t xml:space="preserve"> </w:t>
-            </w:r>
-            <w:proofErr w:type="spellStart"/>
-            <w:r>
-              <w:t>apa</w:t>
-            </w:r>
-            <w:proofErr w:type="spellEnd"/>
-            <w:r>
-              <w:t xml:space="preserve"> </w:t>
-            </w:r>
-            <w:proofErr w:type="spellStart"/>
-            <w:r>
-              <w:t>adanya</w:t>
-            </w:r>
-            <w:proofErr w:type="spellEnd"/>
-            <w:r>
-              <w:t xml:space="preserve"> </w:t>
-            </w:r>
-            <w:proofErr w:type="spellStart"/>
-            <w:r>
-              <w:t>untuk</w:t>
-            </w:r>
-            <w:proofErr w:type="spellEnd"/>
-            <w:r>
-              <w:t xml:space="preserve"> </w:t>
-            </w:r>
-            <w:proofErr w:type="spellStart"/>
-            <w:r>
-              <w:t>menangani</w:t>
-            </w:r>
-            <w:proofErr w:type="spellEnd"/>
-            <w:r>
-              <w:t xml:space="preserve"> </w:t>
-            </w:r>
-            <w:proofErr w:type="spellStart"/>
-            <w:r>
-              <w:t>lapisan</w:t>
-            </w:r>
-            <w:proofErr w:type="spellEnd"/>
-            <w:r>
-              <w:t xml:space="preserve"> </w:t>
+            <w:r>
+              <w:t xml:space="preserve">Dibiarkan/diimpor apa adanya untuk menangani lapisan </w:t>
             </w:r>
             <w:r>
               <w:rPr>
@@ -3250,53 +3175,8 @@
             <w:pPr>
               <w:spacing w:before="20" w:after="20" w:line="252" w:lineRule="auto"/>
             </w:pPr>
-            <w:proofErr w:type="spellStart"/>
-            <w:r>
-              <w:t>profil</w:t>
-            </w:r>
-            <w:proofErr w:type="spellEnd"/>
-            <w:r>
-              <w:t xml:space="preserve">, </w:t>
-            </w:r>
-            <w:proofErr w:type="spellStart"/>
-            <w:r>
-              <w:t>buatPerkenalan</w:t>
-            </w:r>
-            <w:proofErr w:type="spellEnd"/>
-            <w:r>
-              <w:t xml:space="preserve">, </w:t>
-            </w:r>
-            <w:proofErr w:type="spellStart"/>
-            <w:r>
-              <w:t>formatKeahlian</w:t>
-            </w:r>
-            <w:proofErr w:type="spellEnd"/>
-            <w:r>
-              <w:t xml:space="preserve">, dan </w:t>
-            </w:r>
-            <w:proofErr w:type="spellStart"/>
-            <w:r>
-              <w:t>daftarProyek</w:t>
-            </w:r>
-            <w:proofErr w:type="spellEnd"/>
-            <w:r>
-              <w:t xml:space="preserve"> </w:t>
-            </w:r>
-            <w:proofErr w:type="spellStart"/>
-            <w:r>
-              <w:t>dari</w:t>
-            </w:r>
-            <w:proofErr w:type="spellEnd"/>
-            <w:r>
-              <w:t xml:space="preserve"> </w:t>
-            </w:r>
-            <w:proofErr w:type="spellStart"/>
-            <w:r>
-              <w:t>js</w:t>
-            </w:r>
-            <w:proofErr w:type="spellEnd"/>
-            <w:r>
-              <w:t>/app.js</w:t>
+            <w:r>
+              <w:t>profil, buatPerkenalan, formatKeahlian, dan daftarProyek dari js/app.js</w:t>
             </w:r>
           </w:p>
         </w:tc>
@@ -3368,47 +3248,7 @@
               <w:spacing w:before="20" w:after="20" w:line="252" w:lineRule="auto"/>
             </w:pPr>
             <w:r>
-              <w:t xml:space="preserve">Filter </w:t>
-            </w:r>
-            <w:proofErr w:type="spellStart"/>
-            <w:r>
-              <w:t>kategori</w:t>
-            </w:r>
-            <w:proofErr w:type="spellEnd"/>
-            <w:r>
-              <w:t xml:space="preserve"> dan </w:t>
-            </w:r>
-            <w:proofErr w:type="spellStart"/>
-            <w:r>
-              <w:t>logika</w:t>
-            </w:r>
-            <w:proofErr w:type="spellEnd"/>
-            <w:r>
-              <w:t xml:space="preserve"> status </w:t>
-            </w:r>
-            <w:proofErr w:type="spellStart"/>
-            <w:r>
-              <w:t>validasi</w:t>
-            </w:r>
-            <w:proofErr w:type="spellEnd"/>
-            <w:r>
-              <w:t xml:space="preserve"> </w:t>
-            </w:r>
-            <w:proofErr w:type="spellStart"/>
-            <w:r>
-              <w:t>dari</w:t>
-            </w:r>
-            <w:proofErr w:type="spellEnd"/>
-            <w:r>
-              <w:t xml:space="preserve"> </w:t>
-            </w:r>
-            <w:proofErr w:type="spellStart"/>
-            <w:r>
-              <w:t>js</w:t>
-            </w:r>
-            <w:proofErr w:type="spellEnd"/>
-            <w:r>
-              <w:t>/dom.js</w:t>
+              <w:t>Filter kategori dan logika status validasi dari js/dom.js</w:t>
             </w:r>
           </w:p>
         </w:tc>
@@ -3479,85 +3319,8 @@
             <w:pPr>
               <w:spacing w:before="20" w:after="20" w:line="252" w:lineRule="auto"/>
             </w:pPr>
-            <w:proofErr w:type="spellStart"/>
-            <w:r>
-              <w:t>Pemilih</w:t>
-            </w:r>
-            <w:proofErr w:type="spellEnd"/>
-            <w:r>
-              <w:t xml:space="preserve"> </w:t>
-            </w:r>
-            <w:proofErr w:type="spellStart"/>
-            <w:r>
-              <w:t>elemen</w:t>
-            </w:r>
-            <w:proofErr w:type="spellEnd"/>
-            <w:r>
-              <w:t xml:space="preserve"> (</w:t>
-            </w:r>
-            <w:proofErr w:type="spellStart"/>
-            <w:r>
-              <w:t>querySelector</w:t>
-            </w:r>
-            <w:proofErr w:type="spellEnd"/>
-            <w:r>
-              <w:t xml:space="preserve">), </w:t>
-            </w:r>
-            <w:proofErr w:type="spellStart"/>
-            <w:r>
-              <w:t>fungsi</w:t>
-            </w:r>
-            <w:proofErr w:type="spellEnd"/>
-            <w:r>
-              <w:t xml:space="preserve"> </w:t>
-            </w:r>
-            <w:proofErr w:type="spellStart"/>
-            <w:r>
-              <w:t>gambar</w:t>
-            </w:r>
-            <w:proofErr w:type="spellEnd"/>
-            <w:r>
-              <w:t xml:space="preserve">, </w:t>
-            </w:r>
-            <w:proofErr w:type="spellStart"/>
-            <w:r>
-              <w:t>buatKartu</w:t>
-            </w:r>
-            <w:proofErr w:type="spellEnd"/>
-            <w:r>
-              <w:t xml:space="preserve">, render, dan </w:t>
-            </w:r>
-            <w:proofErr w:type="spellStart"/>
-            <w:r>
-              <w:t>validasiForm</w:t>
-            </w:r>
-            <w:proofErr w:type="spellEnd"/>
-            <w:r>
-              <w:t xml:space="preserve"> </w:t>
-            </w:r>
-            <w:proofErr w:type="spellStart"/>
-            <w:r>
-              <w:t>dari</w:t>
-            </w:r>
-            <w:proofErr w:type="spellEnd"/>
-            <w:r>
-              <w:t xml:space="preserve"> </w:t>
-            </w:r>
-            <w:proofErr w:type="spellStart"/>
-            <w:r>
-              <w:t>js</w:t>
-            </w:r>
-            <w:proofErr w:type="spellEnd"/>
-            <w:r>
-              <w:t xml:space="preserve">/app.js dan </w:t>
-            </w:r>
-            <w:proofErr w:type="spellStart"/>
-            <w:r>
-              <w:t>js</w:t>
-            </w:r>
-            <w:proofErr w:type="spellEnd"/>
-            <w:r>
-              <w:t>/dom.js</w:t>
+            <w:r>
+              <w:t>Pemilih elemen (querySelector), fungsi gambar, buatKartu, render, dan validasiForm dari js/app.js dan js/dom.js</w:t>
             </w:r>
           </w:p>
         </w:tc>
@@ -3629,31 +3392,7 @@
               <w:spacing w:before="20" w:after="20" w:line="252" w:lineRule="auto"/>
             </w:pPr>
             <w:r>
-              <w:t xml:space="preserve">Event listener filter (click) dan </w:t>
-            </w:r>
-            <w:proofErr w:type="spellStart"/>
-            <w:r>
-              <w:t>validasi</w:t>
-            </w:r>
-            <w:proofErr w:type="spellEnd"/>
-            <w:r>
-              <w:t xml:space="preserve"> form (input, submit) </w:t>
-            </w:r>
-            <w:proofErr w:type="spellStart"/>
-            <w:r>
-              <w:t>dari</w:t>
-            </w:r>
-            <w:proofErr w:type="spellEnd"/>
-            <w:r>
-              <w:t xml:space="preserve"> </w:t>
-            </w:r>
-            <w:proofErr w:type="spellStart"/>
-            <w:r>
-              <w:t>js</w:t>
-            </w:r>
-            <w:proofErr w:type="spellEnd"/>
-            <w:r>
-              <w:t>/dom.js</w:t>
+              <w:t>Event listener filter (click) dan validasi form (input, submit) dari js/dom.js</w:t>
             </w:r>
           </w:p>
         </w:tc>
@@ -3724,82 +3463,8 @@
             <w:pPr>
               <w:spacing w:before="20" w:after="20" w:line="252" w:lineRule="auto"/>
             </w:pPr>
-            <w:proofErr w:type="spellStart"/>
-            <w:r>
-              <w:t>Pemanggilan</w:t>
-            </w:r>
-            <w:proofErr w:type="spellEnd"/>
-            <w:r>
-              <w:t xml:space="preserve"> </w:t>
-            </w:r>
-            <w:proofErr w:type="spellStart"/>
-            <w:proofErr w:type="gramStart"/>
-            <w:r>
-              <w:t>tampilkan</w:t>
-            </w:r>
-            <w:proofErr w:type="spellEnd"/>
-            <w:r>
-              <w:t>(</w:t>
-            </w:r>
-            <w:proofErr w:type="gramEnd"/>
-            <w:r>
-              <w:t>), render(</w:t>
-            </w:r>
-            <w:proofErr w:type="spellStart"/>
-            <w:r>
-              <w:t>daftarProyek</w:t>
-            </w:r>
-            <w:proofErr w:type="spellEnd"/>
-            <w:r>
-              <w:t xml:space="preserve">), dan </w:t>
-            </w:r>
-            <w:proofErr w:type="spellStart"/>
-            <w:r>
-              <w:t>inisialisasi</w:t>
-            </w:r>
-            <w:proofErr w:type="spellEnd"/>
-            <w:r>
-              <w:t xml:space="preserve"> </w:t>
-            </w:r>
-            <w:proofErr w:type="spellStart"/>
-            <w:r>
-              <w:t>awal</w:t>
-            </w:r>
-            <w:proofErr w:type="spellEnd"/>
-            <w:r>
-              <w:t xml:space="preserve"> </w:t>
-            </w:r>
-            <w:proofErr w:type="spellStart"/>
-            <w:r>
-              <w:t>aplikasi</w:t>
-            </w:r>
-            <w:proofErr w:type="spellEnd"/>
-            <w:r>
-              <w:t xml:space="preserve"> </w:t>
-            </w:r>
-            <w:proofErr w:type="spellStart"/>
-            <w:r>
-              <w:t>dari</w:t>
-            </w:r>
-            <w:proofErr w:type="spellEnd"/>
-            <w:r>
-              <w:t xml:space="preserve"> </w:t>
-            </w:r>
-            <w:proofErr w:type="spellStart"/>
-            <w:r>
-              <w:t>js</w:t>
-            </w:r>
-            <w:proofErr w:type="spellEnd"/>
-            <w:r>
-              <w:t xml:space="preserve">/app.js dan </w:t>
-            </w:r>
-            <w:proofErr w:type="spellStart"/>
-            <w:r>
-              <w:t>js</w:t>
-            </w:r>
-            <w:proofErr w:type="spellEnd"/>
-            <w:r>
-              <w:t>/dom.js</w:t>
+            <w:r>
+              <w:t>Pemanggilan tampilkan(), render(daftarProyek), dan inisialisasi awal aplikasi dari js/app.js dan js/dom.js</w:t>
             </w:r>
           </w:p>
         </w:tc>
@@ -3905,23 +3570,7 @@
                 <w:rFonts w:cs="Carlito"/>
                 <w:sz w:val="19"/>
               </w:rPr>
-              <w:t xml:space="preserve">Folder worksheet-p11/ </w:t>
-            </w:r>
-            <w:proofErr w:type="spellStart"/>
-            <w:r>
-              <w:rPr>
-                <w:rFonts w:cs="Carlito"/>
-                <w:sz w:val="19"/>
-              </w:rPr>
-              <w:t>berisi</w:t>
-            </w:r>
-            <w:proofErr w:type="spellEnd"/>
-            <w:r>
-              <w:rPr>
-                <w:rFonts w:cs="Carlito"/>
-                <w:sz w:val="19"/>
-              </w:rPr>
-              <w:t xml:space="preserve"> profil.html, seluruh CSS, js/app.js, dan js/dom.js</w:t>
+              <w:t>Folder worksheet-p11/ berisi profil.html, seluruh CSS, js/app.js, dan js/dom.js</w:t>
             </w:r>
           </w:p>
         </w:tc>
@@ -5219,6 +4868,9 @@
         <w:spacing w:after="60"/>
       </w:pPr>
       <w:r>
+        <w:rPr>
+          <w:noProof/>
+        </w:rPr>
         <w:drawing>
           <wp:inline distT="0" distB="0" distL="0" distR="0" wp14:anchorId="45C8A1C1" wp14:editId="146EBAB5">
             <wp:extent cx="6192520" cy="1403985"/>
@@ -5261,7 +4913,6 @@
         <w:keepNext/>
         <w:spacing w:before="160" w:after="60"/>
       </w:pPr>
-      <w:proofErr w:type="gramStart"/>
       <w:r>
         <w:rPr>
           <w:rFonts w:cs="Carlito"/>
@@ -5269,16 +4920,7 @@
           <w:color w:val="003796"/>
         </w:rPr>
         <w:lastRenderedPageBreak/>
-        <w:t>B.3  Lima</w:t>
-      </w:r>
-      <w:proofErr w:type="gramEnd"/>
-      <w:r>
-        <w:rPr>
-          <w:rFonts w:cs="Carlito"/>
-          <w:b/>
-          <w:color w:val="003796"/>
-        </w:rPr>
-        <w:t xml:space="preserve"> berkas, lima tanggung jawab</w:t>
+        <w:t>B.3  Lima berkas, lima tanggung jawab</w:t>
       </w:r>
     </w:p>
     <w:p>
@@ -6078,21 +5720,8 @@
               <w:spacing w:before="20" w:after="20" w:line="252" w:lineRule="auto"/>
             </w:pPr>
             <w:r>
-              <w:t xml:space="preserve">Tidak </w:t>
-            </w:r>
-            <w:proofErr w:type="spellStart"/>
-            <w:r>
-              <w:t>ada</w:t>
-            </w:r>
-            <w:proofErr w:type="spellEnd"/>
-            <w:r>
-              <w:t xml:space="preserve"> </w:t>
-            </w:r>
-            <w:proofErr w:type="spellStart"/>
-            <w:r>
-              <w:t>eror</w:t>
-            </w:r>
-            <w:proofErr w:type="spellEnd"/>
+              <w:t>Tidak ada eror</w:t>
+            </w:r>
           </w:p>
         </w:tc>
       </w:tr>
@@ -6162,43 +5791,9 @@
             <w:pPr>
               <w:spacing w:before="20" w:after="20" w:line="252" w:lineRule="auto"/>
             </w:pPr>
-            <w:proofErr w:type="spellStart"/>
-            <w:r>
-              <w:t>Semua</w:t>
-            </w:r>
-            <w:proofErr w:type="spellEnd"/>
-            <w:r>
-              <w:t xml:space="preserve"> </w:t>
-            </w:r>
-            <w:proofErr w:type="spellStart"/>
-            <w:r>
-              <w:t>berjalan</w:t>
-            </w:r>
-            <w:proofErr w:type="spellEnd"/>
-            <w:r>
-              <w:t xml:space="preserve"> denga naman </w:t>
-            </w:r>
-            <w:proofErr w:type="spellStart"/>
-            <w:r>
-              <w:t>tdiak</w:t>
-            </w:r>
-            <w:proofErr w:type="spellEnd"/>
-            <w:r>
-              <w:t xml:space="preserve"> </w:t>
-            </w:r>
-            <w:proofErr w:type="spellStart"/>
-            <w:r>
-              <w:t>ada</w:t>
-            </w:r>
-            <w:proofErr w:type="spellEnd"/>
-            <w:r>
-              <w:t xml:space="preserve"> </w:t>
-            </w:r>
-            <w:proofErr w:type="spellStart"/>
-            <w:r>
-              <w:t>kendala</w:t>
-            </w:r>
-            <w:proofErr w:type="spellEnd"/>
+            <w:r>
+              <w:t>Semua berjalan denga naman tdiak ada kendala</w:t>
+            </w:r>
           </w:p>
         </w:tc>
       </w:tr>
@@ -6268,6 +5863,9 @@
             <w:pPr>
               <w:spacing w:before="20" w:after="20" w:line="252" w:lineRule="auto"/>
             </w:pPr>
+            <w:r>
+              <w:t>Hanya ada import dan 2 pemanggilan awal</w:t>
+            </w:r>
           </w:p>
         </w:tc>
       </w:tr>
@@ -6337,6 +5935,9 @@
             <w:pPr>
               <w:spacing w:before="20" w:after="20" w:line="252" w:lineRule="auto"/>
             </w:pPr>
+            <w:r>
+              <w:t>Total 5 berkas: data.js, state.js, dom.js, events.js, dan app.js</w:t>
+            </w:r>
           </w:p>
         </w:tc>
       </w:tr>
@@ -6406,13 +6007,8 @@
             <w:pPr>
               <w:spacing w:before="20" w:after="20" w:line="252" w:lineRule="auto"/>
             </w:pPr>
-            <w:proofErr w:type="spellStart"/>
-            <w:r>
-              <w:t>Seluruh</w:t>
-            </w:r>
-            <w:proofErr w:type="spellEnd"/>
-            <w:r>
-              <w:t xml:space="preserve"> </w:t>
+            <w:r>
+              <w:t xml:space="preserve">Seluruh </w:t>
             </w:r>
             <w:r>
               <w:rPr>
@@ -6422,42 +6018,8 @@
               <w:t>path</w:t>
             </w:r>
             <w:r>
-              <w:t xml:space="preserve"> import </w:t>
-            </w:r>
-            <w:proofErr w:type="spellStart"/>
-            <w:proofErr w:type="gramStart"/>
-            <w:r>
-              <w:t>diawali</w:t>
-            </w:r>
-            <w:proofErr w:type="spellEnd"/>
-            <w:r>
-              <w:t xml:space="preserve"> .</w:t>
-            </w:r>
-            <w:proofErr w:type="gramEnd"/>
-            <w:r>
-              <w:t xml:space="preserve">/ dan </w:t>
-            </w:r>
-            <w:proofErr w:type="spellStart"/>
-            <w:r>
-              <w:t>menggunakan</w:t>
-            </w:r>
-            <w:proofErr w:type="spellEnd"/>
-            <w:r>
-              <w:t xml:space="preserve"> </w:t>
-            </w:r>
-            <w:proofErr w:type="spellStart"/>
-            <w:r>
-              <w:t>ekstensi</w:t>
-            </w:r>
-            <w:proofErr w:type="spellEnd"/>
-            <w:r>
-              <w:t xml:space="preserve"> .</w:t>
-            </w:r>
-            <w:proofErr w:type="spellStart"/>
-            <w:r>
-              <w:t>js</w:t>
-            </w:r>
-            <w:proofErr w:type="spellEnd"/>
+              <w:t xml:space="preserve"> import diawali ./ dan menggunakan ekstensi .js</w:t>
+            </w:r>
           </w:p>
         </w:tc>
       </w:tr>
@@ -6539,7 +6101,6 @@
                 <w:b/>
                 <w:color w:val="FFFFFF"/>
               </w:rPr>
-              <w:lastRenderedPageBreak/>
               <w:t>▌  SIMPAN KE GIT — SETELAH LEMBAR B</w:t>
             </w:r>
           </w:p>
@@ -12581,6 +12142,7 @@
                 <w:color w:val="003796"/>
                 <w:sz w:val="22"/>
               </w:rPr>
+              <w:lastRenderedPageBreak/>
               <w:t>☐  Pengubah  setiap perubahan keadaan ditulis sebagai fungsi bernama di state.js, dan fungsi itulah yang memanggil render</w:t>
             </w:r>
           </w:p>
@@ -17764,115 +17326,7 @@
         <w:color w:val="5A6080"/>
         <w:sz w:val="15"/>
       </w:rPr>
-      <w:t>PABW 2026/</w:t>
-    </w:r>
-    <w:proofErr w:type="gramStart"/>
-    <w:r>
-      <w:rPr>
-        <w:rFonts w:cs="Carlito"/>
-        <w:color w:val="5A6080"/>
-        <w:sz w:val="15"/>
-      </w:rPr>
-      <w:t>2027  ·</w:t>
-    </w:r>
-    <w:proofErr w:type="gramEnd"/>
-    <w:r>
-      <w:rPr>
-        <w:rFonts w:cs="Carlito"/>
-        <w:color w:val="5A6080"/>
-        <w:sz w:val="15"/>
-      </w:rPr>
-      <w:t xml:space="preserve">  </w:t>
-    </w:r>
-    <w:proofErr w:type="spellStart"/>
-    <w:r>
-      <w:rPr>
-        <w:rFonts w:cs="Carlito"/>
-        <w:color w:val="5A6080"/>
-        <w:sz w:val="15"/>
-      </w:rPr>
-      <w:t>Pertemuan</w:t>
-    </w:r>
-    <w:proofErr w:type="spellEnd"/>
-    <w:r>
-      <w:rPr>
-        <w:rFonts w:cs="Carlito"/>
-        <w:color w:val="5A6080"/>
-        <w:sz w:val="15"/>
-      </w:rPr>
-      <w:t xml:space="preserve"> </w:t>
-    </w:r>
-    <w:proofErr w:type="gramStart"/>
-    <w:r>
-      <w:rPr>
-        <w:rFonts w:cs="Carlito"/>
-        <w:color w:val="5A6080"/>
-        <w:sz w:val="15"/>
-      </w:rPr>
-      <w:t>11  ·</w:t>
-    </w:r>
-    <w:proofErr w:type="gramEnd"/>
-    <w:r>
-      <w:rPr>
-        <w:rFonts w:cs="Carlito"/>
-        <w:color w:val="5A6080"/>
-        <w:sz w:val="15"/>
-      </w:rPr>
-      <w:t xml:space="preserve">  Modul, State, dan </w:t>
-    </w:r>
-    <w:proofErr w:type="spellStart"/>
-    <w:r>
-      <w:rPr>
-        <w:rFonts w:cs="Carlito"/>
-        <w:color w:val="5A6080"/>
-        <w:sz w:val="15"/>
-      </w:rPr>
-      <w:t>Penyimpanan</w:t>
-    </w:r>
-    <w:proofErr w:type="spellEnd"/>
-    <w:r>
-      <w:rPr>
-        <w:rFonts w:cs="Carlito"/>
-        <w:color w:val="5A6080"/>
-        <w:sz w:val="15"/>
-      </w:rPr>
-      <w:t xml:space="preserve"> </w:t>
-    </w:r>
-    <w:proofErr w:type="gramStart"/>
-    <w:r>
-      <w:rPr>
-        <w:rFonts w:cs="Carlito"/>
-        <w:color w:val="5A6080"/>
-        <w:sz w:val="15"/>
-      </w:rPr>
-      <w:t>Klien  ·</w:t>
-    </w:r>
-    <w:proofErr w:type="gramEnd"/>
-    <w:r>
-      <w:rPr>
-        <w:rFonts w:cs="Carlito"/>
-        <w:color w:val="5A6080"/>
-        <w:sz w:val="15"/>
-      </w:rPr>
-      <w:t xml:space="preserve">  Universitas Islam </w:t>
-    </w:r>
-    <w:proofErr w:type="gramStart"/>
-    <w:r>
-      <w:rPr>
-        <w:rFonts w:cs="Carlito"/>
-        <w:color w:val="5A6080"/>
-        <w:sz w:val="15"/>
-      </w:rPr>
-      <w:t>Indonesia  ·</w:t>
-    </w:r>
-    <w:proofErr w:type="gramEnd"/>
-    <w:r>
-      <w:rPr>
-        <w:rFonts w:cs="Carlito"/>
-        <w:color w:val="5A6080"/>
-        <w:sz w:val="15"/>
-      </w:rPr>
-      <w:t xml:space="preserve">  halaman</w:t>
+      <w:t>PABW 2026/2027  ·  Pertemuan 11  ·  Modul, State, dan Penyimpanan Klien  ·  Universitas Islam Indonesia  ·  halaman</w:t>
     </w:r>
     <w:r>
       <w:fldChar w:fldCharType="begin"/>

</xml_diff>